<commit_message>
switching asian font for paragrph to jomolhari instead of jomolhari-id
</commit_message>
<xml_diff>
--- a/resources/tibtext-styled-tpl-2023-09-26.docx
+++ b/resources/tibtext-styled-tpl-2023-09-26.docx
@@ -1,6 +1,6 @@
 
 <file path=word/document.xml><?xml version="1.0" encoding="utf-8"?>
-<w:document xmlns:wpc="http://schemas.microsoft.com/office/word/2010/wordprocessingCanvas" xmlns:cx="http://schemas.microsoft.com/office/drawing/2014/chartex" xmlns:cx1="http://schemas.microsoft.com/office/drawing/2015/9/8/chartex" xmlns:cx2="http://schemas.microsoft.com/office/drawing/2015/10/21/chartex" xmlns:cx3="http://schemas.microsoft.com/office/drawing/2016/5/9/chartex" xmlns:cx4="http://schemas.microsoft.com/office/drawing/2016/5/10/chartex" xmlns:cx5="http://schemas.microsoft.com/office/drawing/2016/5/11/chartex" xmlns:cx6="http://schemas.microsoft.com/office/drawing/2016/5/12/chartex" xmlns:cx7="http://schemas.microsoft.com/office/drawing/2016/5/13/chartex" xmlns:cx8="http://schemas.microsoft.com/office/drawing/2016/5/14/chartex" xmlns:mc="http://schemas.openxmlformats.org/markup-compatibility/2006" xmlns:aink="http://schemas.microsoft.com/office/drawing/2016/ink" xmlns:am3d="http://schemas.microsoft.com/office/drawing/2017/model3d" xmlns:o="urn:schemas-microsoft-com:office:office" xmlns:oel="http://schemas.microsoft.com/office/2019/extlst" xmlns:r="http://schemas.openxmlformats.org/officeDocument/2006/relationships" xmlns:m="http://schemas.openxmlformats.org/officeDocument/2006/math" xmlns:v="urn:schemas-microsoft-com:vml" xmlns:wp14="http://schemas.microsoft.com/office/word/2010/wordprocessingDrawing" xmlns:wp="http://schemas.openxmlformats.org/drawingml/2006/wordprocessingDrawing" xmlns:w10="urn:schemas-microsoft-com:office:word" xmlns:w="http://schemas.openxmlformats.org/wordprocessingml/2006/main" xmlns:w14="http://schemas.microsoft.com/office/word/2010/wordml" xmlns:w15="http://schemas.microsoft.com/office/word/2012/wordml" xmlns:w16cex="http://schemas.microsoft.com/office/word/2018/wordml/cex" xmlns:w16cid="http://schemas.microsoft.com/office/word/2016/wordml/cid" xmlns:w16="http://schemas.microsoft.com/office/word/2018/wordml" xmlns:w16sdtdh="http://schemas.microsoft.com/office/word/2020/wordml/sdtdatahash" xmlns:w16se="http://schemas.microsoft.com/office/word/2015/wordml/symex" xmlns:wpg="http://schemas.microsoft.com/office/word/2010/wordprocessingGroup" xmlns:wpi="http://schemas.microsoft.com/office/word/2010/wordprocessingInk" xmlns:wne="http://schemas.microsoft.com/office/word/2006/wordml" xmlns:wps="http://schemas.microsoft.com/office/word/2010/wordprocessingShape" mc:Ignorable="w14 w15 w16se w16cid w16 w16cex w16sdtdh wp14">
+<w:document xmlns:wpc="http://schemas.microsoft.com/office/word/2010/wordprocessingCanvas" xmlns:cx="http://schemas.microsoft.com/office/drawing/2014/chartex" xmlns:cx1="http://schemas.microsoft.com/office/drawing/2015/9/8/chartex" xmlns:cx2="http://schemas.microsoft.com/office/drawing/2015/10/21/chartex" xmlns:cx3="http://schemas.microsoft.com/office/drawing/2016/5/9/chartex" xmlns:cx4="http://schemas.microsoft.com/office/drawing/2016/5/10/chartex" xmlns:cx5="http://schemas.microsoft.com/office/drawing/2016/5/11/chartex" xmlns:cx6="http://schemas.microsoft.com/office/drawing/2016/5/12/chartex" xmlns:cx7="http://schemas.microsoft.com/office/drawing/2016/5/13/chartex" xmlns:cx8="http://schemas.microsoft.com/office/drawing/2016/5/14/chartex" xmlns:mc="http://schemas.openxmlformats.org/markup-compatibility/2006" xmlns:m="http://schemas.openxmlformats.org/officeDocument/2006/math" xmlns:aink="http://schemas.microsoft.com/office/drawing/2016/ink" xmlns:am3d="http://schemas.microsoft.com/office/drawing/2017/model3d" xmlns:oel="http://schemas.microsoft.com/office/2019/extlst" xmlns:r="http://schemas.openxmlformats.org/officeDocument/2006/relationships" xmlns:wp14="http://schemas.microsoft.com/office/word/2010/wordprocessingDrawing" xmlns:wp="http://schemas.openxmlformats.org/drawingml/2006/wordprocessingDrawing" xmlns:wpg="http://schemas.microsoft.com/office/word/2010/wordprocessingGroup" xmlns:wpi="http://schemas.microsoft.com/office/word/2010/wordprocessingInk" xmlns:wps="http://schemas.microsoft.com/office/word/2010/wordprocessingShape" xmlns:o="urn:schemas-microsoft-com:office:office" xmlns:v="urn:schemas-microsoft-com:vml" xmlns:w10="urn:schemas-microsoft-com:office:word" xmlns:w="http://schemas.openxmlformats.org/wordprocessingml/2006/main" xmlns:w14="http://schemas.microsoft.com/office/word/2010/wordml" xmlns:w15="http://schemas.microsoft.com/office/word/2012/wordml" xmlns:w16cex="http://schemas.microsoft.com/office/word/2018/wordml/cex" xmlns:w16cid="http://schemas.microsoft.com/office/word/2016/wordml/cid" xmlns:w16="http://schemas.microsoft.com/office/word/2018/wordml" xmlns:w16sdtdh="http://schemas.microsoft.com/office/word/2020/wordml/sdtdatahash" xmlns:w16sdtfl="http://schemas.microsoft.com/office/word/2024/wordml/sdtformatlock" xmlns:w16se="http://schemas.microsoft.com/office/word/2015/wordml/symex" xmlns:w16du="http://schemas.microsoft.com/office/word/2023/wordml/word16du" xmlns:wne="http://schemas.microsoft.com/office/word/2006/wordml" mc:Ignorable="w14 w15 w16se w16cid w16 w16cex w16sdtdh w16sdtfl w16du wp14">
   <w:body>
     <w:p/>
     <w:sectPr>
@@ -14,7 +14,7 @@
 </file>
 
 <file path=word/numbering.xml><?xml version="1.0" encoding="utf-8"?>
-<w:numbering xmlns:wpc="http://schemas.microsoft.com/office/word/2010/wordprocessingCanvas" xmlns:cx="http://schemas.microsoft.com/office/drawing/2014/chartex" xmlns:cx1="http://schemas.microsoft.com/office/drawing/2015/9/8/chartex" xmlns:cx2="http://schemas.microsoft.com/office/drawing/2015/10/21/chartex" xmlns:cx3="http://schemas.microsoft.com/office/drawing/2016/5/9/chartex" xmlns:cx4="http://schemas.microsoft.com/office/drawing/2016/5/10/chartex" xmlns:cx5="http://schemas.microsoft.com/office/drawing/2016/5/11/chartex" xmlns:cx6="http://schemas.microsoft.com/office/drawing/2016/5/12/chartex" xmlns:cx7="http://schemas.microsoft.com/office/drawing/2016/5/13/chartex" xmlns:cx8="http://schemas.microsoft.com/office/drawing/2016/5/14/chartex" xmlns:mc="http://schemas.openxmlformats.org/markup-compatibility/2006" xmlns:aink="http://schemas.microsoft.com/office/drawing/2016/ink" xmlns:am3d="http://schemas.microsoft.com/office/drawing/2017/model3d" xmlns:o="urn:schemas-microsoft-com:office:office" xmlns:oel="http://schemas.microsoft.com/office/2019/extlst" xmlns:r="http://schemas.openxmlformats.org/officeDocument/2006/relationships" xmlns:m="http://schemas.openxmlformats.org/officeDocument/2006/math" xmlns:v="urn:schemas-microsoft-com:vml" xmlns:wp14="http://schemas.microsoft.com/office/word/2010/wordprocessingDrawing" xmlns:wp="http://schemas.openxmlformats.org/drawingml/2006/wordprocessingDrawing" xmlns:w10="urn:schemas-microsoft-com:office:word" xmlns:w="http://schemas.openxmlformats.org/wordprocessingml/2006/main" xmlns:w14="http://schemas.microsoft.com/office/word/2010/wordml" xmlns:w15="http://schemas.microsoft.com/office/word/2012/wordml" xmlns:w16cex="http://schemas.microsoft.com/office/word/2018/wordml/cex" xmlns:w16cid="http://schemas.microsoft.com/office/word/2016/wordml/cid" xmlns:w16="http://schemas.microsoft.com/office/word/2018/wordml" xmlns:w16sdtdh="http://schemas.microsoft.com/office/word/2020/wordml/sdtdatahash" xmlns:w16se="http://schemas.microsoft.com/office/word/2015/wordml/symex" xmlns:wpg="http://schemas.microsoft.com/office/word/2010/wordprocessingGroup" xmlns:wpi="http://schemas.microsoft.com/office/word/2010/wordprocessingInk" xmlns:wne="http://schemas.microsoft.com/office/word/2006/wordml" xmlns:wps="http://schemas.microsoft.com/office/word/2010/wordprocessingShape" mc:Ignorable="w14 w15 w16se w16cid w16 w16cex w16sdtdh wp14">
+<w:numbering xmlns:wpc="http://schemas.microsoft.com/office/word/2010/wordprocessingCanvas" xmlns:cx="http://schemas.microsoft.com/office/drawing/2014/chartex" xmlns:cx1="http://schemas.microsoft.com/office/drawing/2015/9/8/chartex" xmlns:cx2="http://schemas.microsoft.com/office/drawing/2015/10/21/chartex" xmlns:cx3="http://schemas.microsoft.com/office/drawing/2016/5/9/chartex" xmlns:cx4="http://schemas.microsoft.com/office/drawing/2016/5/10/chartex" xmlns:cx5="http://schemas.microsoft.com/office/drawing/2016/5/11/chartex" xmlns:cx6="http://schemas.microsoft.com/office/drawing/2016/5/12/chartex" xmlns:cx7="http://schemas.microsoft.com/office/drawing/2016/5/13/chartex" xmlns:cx8="http://schemas.microsoft.com/office/drawing/2016/5/14/chartex" xmlns:mc="http://schemas.openxmlformats.org/markup-compatibility/2006" xmlns:m="http://schemas.openxmlformats.org/officeDocument/2006/math" xmlns:aink="http://schemas.microsoft.com/office/drawing/2016/ink" xmlns:am3d="http://schemas.microsoft.com/office/drawing/2017/model3d" xmlns:oel="http://schemas.microsoft.com/office/2019/extlst" xmlns:r="http://schemas.openxmlformats.org/officeDocument/2006/relationships" xmlns:wp14="http://schemas.microsoft.com/office/word/2010/wordprocessingDrawing" xmlns:wp="http://schemas.openxmlformats.org/drawingml/2006/wordprocessingDrawing" xmlns:wpg="http://schemas.microsoft.com/office/word/2010/wordprocessingGroup" xmlns:wpi="http://schemas.microsoft.com/office/word/2010/wordprocessingInk" xmlns:wps="http://schemas.microsoft.com/office/word/2010/wordprocessingShape" xmlns:o="urn:schemas-microsoft-com:office:office" xmlns:v="urn:schemas-microsoft-com:vml" xmlns:w10="urn:schemas-microsoft-com:office:word" xmlns:w="http://schemas.openxmlformats.org/wordprocessingml/2006/main" xmlns:w14="http://schemas.microsoft.com/office/word/2010/wordml" xmlns:w15="http://schemas.microsoft.com/office/word/2012/wordml" xmlns:w16cex="http://schemas.microsoft.com/office/word/2018/wordml/cex" xmlns:w16cid="http://schemas.microsoft.com/office/word/2016/wordml/cid" xmlns:w16="http://schemas.microsoft.com/office/word/2018/wordml" xmlns:w16sdtdh="http://schemas.microsoft.com/office/word/2020/wordml/sdtdatahash" xmlns:w16sdtfl="http://schemas.microsoft.com/office/word/2024/wordml/sdtformatlock" xmlns:w16se="http://schemas.microsoft.com/office/word/2015/wordml/symex" xmlns:w16du="http://schemas.microsoft.com/office/word/2023/wordml/word16du" xmlns:wne="http://schemas.microsoft.com/office/word/2006/wordml" mc:Ignorable="w14 w15 w16se w16cid w16 w16cex w16sdtdh w16sdtfl w16du wp14">
   <w:abstractNum w:abstractNumId="0" w15:restartNumberingAfterBreak="0">
     <w:nsid w:val="FFFFFF88"/>
     <w:multiLevelType w:val="singleLevel"/>
@@ -1080,7 +1080,7 @@
 </file>
 
 <file path=word/styles.xml><?xml version="1.0" encoding="utf-8"?>
-<w:styles xmlns:mc="http://schemas.openxmlformats.org/markup-compatibility/2006" xmlns:r="http://schemas.openxmlformats.org/officeDocument/2006/relationships" xmlns:w="http://schemas.openxmlformats.org/wordprocessingml/2006/main" xmlns:w14="http://schemas.microsoft.com/office/word/2010/wordml" xmlns:w15="http://schemas.microsoft.com/office/word/2012/wordml" xmlns:w16cex="http://schemas.microsoft.com/office/word/2018/wordml/cex" xmlns:w16cid="http://schemas.microsoft.com/office/word/2016/wordml/cid" xmlns:w16="http://schemas.microsoft.com/office/word/2018/wordml" xmlns:w16sdtdh="http://schemas.microsoft.com/office/word/2020/wordml/sdtdatahash" xmlns:w16se="http://schemas.microsoft.com/office/word/2015/wordml/symex" mc:Ignorable="w14 w15 w16se w16cid w16 w16cex w16sdtdh">
+<w:styles xmlns:mc="http://schemas.openxmlformats.org/markup-compatibility/2006" xmlns:r="http://schemas.openxmlformats.org/officeDocument/2006/relationships" xmlns:w="http://schemas.openxmlformats.org/wordprocessingml/2006/main" xmlns:w14="http://schemas.microsoft.com/office/word/2010/wordml" xmlns:w15="http://schemas.microsoft.com/office/word/2012/wordml" xmlns:w16cex="http://schemas.microsoft.com/office/word/2018/wordml/cex" xmlns:w16cid="http://schemas.microsoft.com/office/word/2016/wordml/cid" xmlns:w16="http://schemas.microsoft.com/office/word/2018/wordml" xmlns:w16sdtdh="http://schemas.microsoft.com/office/word/2020/wordml/sdtdatahash" xmlns:w16sdtfl="http://schemas.microsoft.com/office/word/2024/wordml/sdtformatlock" xmlns:w16se="http://schemas.microsoft.com/office/word/2015/wordml/symex" xmlns:w16du="http://schemas.microsoft.com/office/word/2023/wordml/word16du" mc:Ignorable="w14 w15 w16se w16cid w16 w16cex w16sdtdh w16sdtfl w16du">
   <w:docDefaults>
     <w:rPrDefault>
       <w:rPr>
@@ -2838,7 +2838,7 @@
     <w:link w:val="ParagraphChar"/>
     <w:autoRedefine/>
     <w:qFormat/>
-    <w:rsid w:val="009429CA"/>
+    <w:rsid w:val="007A63D9"/>
     <w:pPr>
       <w:widowControl w:val="0"/>
       <w:autoSpaceDE w:val="0"/>
@@ -2848,14 +2848,18 @@
       <w:ind w:firstLine="187"/>
       <w:jc w:val="both"/>
     </w:pPr>
+    <w:rPr>
+      <w:rFonts w:cs="Jomolhari"/>
+    </w:rPr>
   </w:style>
   <w:style w:type="character" w:customStyle="1" w:styleId="ParagraphChar">
     <w:name w:val="Paragraph Char"/>
     <w:aliases w:val="p Char"/>
     <w:basedOn w:val="DefaultParagraphFont"/>
     <w:link w:val="Paragraph"/>
-    <w:rsid w:val="009429CA"/>
-    <w:rPr>
+    <w:rsid w:val="007A63D9"/>
+    <w:rPr>
+      <w:rFonts w:cs="Jomolhari"/>
       <w:kern w:val="0"/>
       <w:lang w:bidi="bo-CN"/>
       <w14:ligatures w14:val="none"/>

</xml_diff>